<commit_message>
Remove oracle progression; add Example 3 update stream; clean results table
- Remove calibration journey (86.7%→16.7%) from README and report — show only final results
- Add full update stream for Example 3 in report.md
- README results table now shows both models (claude-sonnet-4-6 + o3) side by side
- Regenerate report.docx

Co-Authored-By: Claude Sonnet 4.6 <noreply@anthropic.com>
</commit_message>
<xml_diff>
--- a/report.docx
+++ b/report.docx
@@ -14,7 +14,7 @@
           <w:color w:val="1E203A"/>
           <w:sz w:val="44"/>
         </w:rPr>
-        <w:t>PolicyBench: A No-Oracle Policy-Maintenance Benchmark for Frontier Models</w:t>
+        <w:t>StateBench: A No-Oracle Policy-Maintenance Benchmark for Frontier Models</w:t>
       </w:r>
     </w:p>
     <w:p>
@@ -91,7 +91,7 @@
           <w:color w:val="444D5E"/>
           <w:sz w:val="22"/>
         </w:rPr>
-        <w:t>PolicyBench tests whether a frontier model can maintain global coherence in an evolving policy artifact under a stream of semantically specified updates — without any behavioral oracle feedback before final submission.</w:t>
+        <w:t>StateBench tests whether a frontier model can maintain global coherence in an evolving policy artifact under a stream of semantically specified updates — without any behavioral oracle feedback before final submission.</w:t>
       </w:r>
       <w:r>
         <w:rPr>
@@ -4950,6 +4950,444 @@
           <w:color w:val="444D5E"/>
           <w:sz w:val="22"/>
         </w:rPr>
+      </w:r>
+      <w:r>
+        <w:rPr>
+          <w:rFonts w:ascii="Calibri" w:hAnsi="Calibri"/>
+          <w:b/>
+          <w:i w:val="0"/>
+          <w:color w:val="444D5E"/>
+          <w:sz w:val="22"/>
+        </w:rPr>
+        <w:t>Update stream:</w:t>
+      </w:r>
+      <w:r>
+        <w:rPr>
+          <w:rFonts w:ascii="Calibri" w:hAnsi="Calibri"/>
+          <w:b w:val="0"/>
+          <w:i w:val="0"/>
+          <w:color w:val="444D5E"/>
+          <w:sz w:val="22"/>
+        </w:rPr>
+      </w:r>
+    </w:p>
+    <w:p>
+      <w:pPr>
+        <w:spacing w:before="20" w:after="60"/>
+        <w:ind w:left="454"/>
+      </w:pPr>
+      <w:r>
+        <w:rPr>
+          <w:rFonts w:ascii="Calibri" w:hAnsi="Calibri"/>
+          <w:b/>
+          <w:i w:val="0"/>
+          <w:color w:val="6366F1"/>
+          <w:sz w:val="22"/>
+        </w:rPr>
+        <w:t xml:space="preserve">1. </w:t>
+      </w:r>
+      <w:r>
+        <w:rPr>
+          <w:rFonts w:ascii="Calibri" w:hAnsi="Calibri"/>
+          <w:b w:val="0"/>
+          <w:i w:val="0"/>
+          <w:color w:val="444D5E"/>
+          <w:sz w:val="22"/>
+        </w:rPr>
+      </w:r>
+      <w:r>
+        <w:rPr>
+          <w:rFonts w:ascii="Courier New" w:hAnsi="Courier New"/>
+          <w:b w:val="0"/>
+          <w:i w:val="0"/>
+          <w:color w:val="1F2937"/>
+          <w:sz w:val="18"/>
+        </w:rPr>
+        <w:t>Cases where the request amount is less than 100 should result in deny the request.</w:t>
+      </w:r>
+      <w:r>
+        <w:rPr>
+          <w:rFonts w:ascii="Calibri" w:hAnsi="Calibri"/>
+          <w:b w:val="0"/>
+          <w:i w:val="0"/>
+          <w:color w:val="444D5E"/>
+          <w:sz w:val="22"/>
+        </w:rPr>
+        <w:t xml:space="preserve"> *(chain_create)*</w:t>
+      </w:r>
+    </w:p>
+    <w:p>
+      <w:pPr>
+        <w:spacing w:before="20" w:after="60"/>
+        <w:ind w:left="454"/>
+      </w:pPr>
+      <w:r>
+        <w:rPr>
+          <w:rFonts w:ascii="Calibri" w:hAnsi="Calibri"/>
+          <w:b/>
+          <w:i w:val="0"/>
+          <w:color w:val="6366F1"/>
+          <w:sz w:val="22"/>
+        </w:rPr>
+        <w:t xml:space="preserve">2. </w:t>
+      </w:r>
+      <w:r>
+        <w:rPr>
+          <w:rFonts w:ascii="Calibri" w:hAnsi="Calibri"/>
+          <w:b w:val="0"/>
+          <w:i w:val="0"/>
+          <w:color w:val="444D5E"/>
+          <w:sz w:val="22"/>
+        </w:rPr>
+      </w:r>
+      <w:r>
+        <w:rPr>
+          <w:rFonts w:ascii="Courier New" w:hAnsi="Courier New"/>
+          <w:b w:val="0"/>
+          <w:i w:val="0"/>
+          <w:color w:val="1F2937"/>
+          <w:sz w:val="18"/>
+        </w:rPr>
+        <w:t>Cases satisfying both [the budget status is not active, and the request amount is at least 5000, and the department is engineering or marketing or ops or sales] and [the budget status is not active] result in require manager approval, not auto-approve the request.</w:t>
+      </w:r>
+      <w:r>
+        <w:rPr>
+          <w:rFonts w:ascii="Calibri" w:hAnsi="Calibri"/>
+          <w:b w:val="0"/>
+          <w:i w:val="0"/>
+          <w:color w:val="444D5E"/>
+          <w:sz w:val="22"/>
+        </w:rPr>
+        <w:t xml:space="preserve"> *(priority swap #1)*</w:t>
+      </w:r>
+    </w:p>
+    <w:p>
+      <w:pPr>
+        <w:spacing w:before="20" w:after="60"/>
+        <w:ind w:left="454"/>
+      </w:pPr>
+      <w:r>
+        <w:rPr>
+          <w:rFonts w:ascii="Calibri" w:hAnsi="Calibri"/>
+          <w:b/>
+          <w:i w:val="0"/>
+          <w:color w:val="6366F1"/>
+          <w:sz w:val="22"/>
+        </w:rPr>
+        <w:t xml:space="preserve">3. </w:t>
+      </w:r>
+      <w:r>
+        <w:rPr>
+          <w:rFonts w:ascii="Calibri" w:hAnsi="Calibri"/>
+          <w:b w:val="0"/>
+          <w:i w:val="0"/>
+          <w:color w:val="444D5E"/>
+          <w:sz w:val="22"/>
+        </w:rPr>
+      </w:r>
+      <w:r>
+        <w:rPr>
+          <w:rFonts w:ascii="Courier New" w:hAnsi="Courier New"/>
+          <w:b w:val="0"/>
+          <w:i w:val="0"/>
+          <w:color w:val="1F2937"/>
+          <w:sz w:val="18"/>
+        </w:rPr>
+        <w:t>No distinct rule governs cases where the budget status is active, and the recurring flag is not active.</w:t>
+      </w:r>
+      <w:r>
+        <w:rPr>
+          <w:rFonts w:ascii="Calibri" w:hAnsi="Calibri"/>
+          <w:b w:val="0"/>
+          <w:i w:val="0"/>
+          <w:color w:val="444D5E"/>
+          <w:sz w:val="22"/>
+        </w:rPr>
+        <w:t xml:space="preserve"> *(revoke #1)*</w:t>
+      </w:r>
+    </w:p>
+    <w:p>
+      <w:pPr>
+        <w:spacing w:before="20" w:after="60"/>
+        <w:ind w:left="454"/>
+      </w:pPr>
+      <w:r>
+        <w:rPr>
+          <w:rFonts w:ascii="Calibri" w:hAnsi="Calibri"/>
+          <w:b/>
+          <w:i w:val="0"/>
+          <w:color w:val="6366F1"/>
+          <w:sz w:val="22"/>
+        </w:rPr>
+        <w:t xml:space="preserve">4. </w:t>
+      </w:r>
+      <w:r>
+        <w:rPr>
+          <w:rFonts w:ascii="Calibri" w:hAnsi="Calibri"/>
+          <w:b w:val="0"/>
+          <w:i w:val="0"/>
+          <w:color w:val="444D5E"/>
+          <w:sz w:val="22"/>
+        </w:rPr>
+      </w:r>
+      <w:r>
+        <w:rPr>
+          <w:rFonts w:ascii="Courier New" w:hAnsi="Courier New"/>
+          <w:b w:val="0"/>
+          <w:i w:val="0"/>
+          <w:color w:val="1F2937"/>
+          <w:sz w:val="18"/>
+        </w:rPr>
+        <w:t>When the request amount is less than 100, require manager approval.</w:t>
+      </w:r>
+      <w:r>
+        <w:rPr>
+          <w:rFonts w:ascii="Calibri" w:hAnsi="Calibri"/>
+          <w:b w:val="0"/>
+          <w:i w:val="0"/>
+          <w:color w:val="444D5E"/>
+          <w:sz w:val="22"/>
+        </w:rPr>
+        <w:t xml:space="preserve"> *(chain_ref — changes decision of rule from update 1)*</w:t>
+      </w:r>
+    </w:p>
+    <w:p>
+      <w:pPr>
+        <w:spacing w:before="20" w:after="60"/>
+        <w:ind w:left="454"/>
+      </w:pPr>
+      <w:r>
+        <w:rPr>
+          <w:rFonts w:ascii="Calibri" w:hAnsi="Calibri"/>
+          <w:b/>
+          <w:i w:val="0"/>
+          <w:color w:val="6366F1"/>
+          <w:sz w:val="22"/>
+        </w:rPr>
+        <w:t xml:space="preserve">5. </w:t>
+      </w:r>
+      <w:r>
+        <w:rPr>
+          <w:rFonts w:ascii="Calibri" w:hAnsi="Calibri"/>
+          <w:b w:val="0"/>
+          <w:i w:val="0"/>
+          <w:color w:val="444D5E"/>
+          <w:sz w:val="22"/>
+        </w:rPr>
+      </w:r>
+      <w:r>
+        <w:rPr>
+          <w:rFonts w:ascii="Courier New" w:hAnsi="Courier New"/>
+          <w:b w:val="0"/>
+          <w:i w:val="0"/>
+          <w:color w:val="1F2937"/>
+          <w:sz w:val="18"/>
+        </w:rPr>
+        <w:t>Where the request amount is at least 5000, and the expense type is travel or consulting and the budget status is active overlap, auto-approve the request is the applicable outcome.</w:t>
+      </w:r>
+      <w:r>
+        <w:rPr>
+          <w:rFonts w:ascii="Calibri" w:hAnsi="Calibri"/>
+          <w:b w:val="0"/>
+          <w:i w:val="0"/>
+          <w:color w:val="444D5E"/>
+          <w:sz w:val="22"/>
+        </w:rPr>
+        <w:t xml:space="preserve"> *(priority swap #2)*</w:t>
+      </w:r>
+    </w:p>
+    <w:p>
+      <w:pPr>
+        <w:spacing w:before="20" w:after="60"/>
+        <w:ind w:left="454"/>
+      </w:pPr>
+      <w:r>
+        <w:rPr>
+          <w:rFonts w:ascii="Calibri" w:hAnsi="Calibri"/>
+          <w:b/>
+          <w:i w:val="0"/>
+          <w:color w:val="6366F1"/>
+          <w:sz w:val="22"/>
+        </w:rPr>
+        <w:t xml:space="preserve">6. </w:t>
+      </w:r>
+      <w:r>
+        <w:rPr>
+          <w:rFonts w:ascii="Calibri" w:hAnsi="Calibri"/>
+          <w:b w:val="0"/>
+          <w:i w:val="0"/>
+          <w:color w:val="444D5E"/>
+          <w:sz w:val="22"/>
+        </w:rPr>
+      </w:r>
+      <w:r>
+        <w:rPr>
+          <w:rFonts w:ascii="Courier New" w:hAnsi="Courier New"/>
+          <w:b w:val="0"/>
+          <w:i w:val="0"/>
+          <w:color w:val="1F2937"/>
+          <w:sz w:val="18"/>
+        </w:rPr>
+        <w:t>No distinct rule governs cases where the request amount is less than 100.</w:t>
+      </w:r>
+      <w:r>
+        <w:rPr>
+          <w:rFonts w:ascii="Calibri" w:hAnsi="Calibri"/>
+          <w:b w:val="0"/>
+          <w:i w:val="0"/>
+          <w:color w:val="444D5E"/>
+          <w:sz w:val="22"/>
+        </w:rPr>
+        <w:t xml:space="preserve"> *(revoke #2)*</w:t>
+      </w:r>
+    </w:p>
+    <w:p>
+      <w:pPr>
+        <w:spacing w:before="20" w:after="60"/>
+        <w:ind w:left="454"/>
+      </w:pPr>
+      <w:r>
+        <w:rPr>
+          <w:rFonts w:ascii="Calibri" w:hAnsi="Calibri"/>
+          <w:b/>
+          <w:i w:val="0"/>
+          <w:color w:val="6366F1"/>
+          <w:sz w:val="22"/>
+        </w:rPr>
+        <w:t xml:space="preserve">7. </w:t>
+      </w:r>
+      <w:r>
+        <w:rPr>
+          <w:rFonts w:ascii="Calibri" w:hAnsi="Calibri"/>
+          <w:b w:val="0"/>
+          <w:i w:val="0"/>
+          <w:color w:val="444D5E"/>
+          <w:sz w:val="22"/>
+        </w:rPr>
+      </w:r>
+      <w:r>
+        <w:rPr>
+          <w:rFonts w:ascii="Courier New" w:hAnsi="Courier New"/>
+          <w:b w:val="0"/>
+          <w:i w:val="0"/>
+          <w:color w:val="1F2937"/>
+          <w:sz w:val="18"/>
+        </w:rPr>
+        <w:t>Where the request amount is at least 5000, and the budget status is active, and the department is sales and the requester level is director or intern or vp, and the request amount exceeds 10000 overlap, require VP approval is the applicable outcome.</w:t>
+      </w:r>
+      <w:r>
+        <w:rPr>
+          <w:rFonts w:ascii="Calibri" w:hAnsi="Calibri"/>
+          <w:b w:val="0"/>
+          <w:i w:val="0"/>
+          <w:color w:val="444D5E"/>
+          <w:sz w:val="22"/>
+        </w:rPr>
+        <w:t xml:space="preserve"> *(priority swap #3)*</w:t>
+      </w:r>
+    </w:p>
+    <w:p>
+      <w:pPr>
+        <w:spacing w:before="20" w:after="60"/>
+        <w:ind w:left="454"/>
+      </w:pPr>
+      <w:r>
+        <w:rPr>
+          <w:rFonts w:ascii="Calibri" w:hAnsi="Calibri"/>
+          <w:b/>
+          <w:i w:val="0"/>
+          <w:color w:val="6366F1"/>
+          <w:sz w:val="22"/>
+        </w:rPr>
+        <w:t xml:space="preserve">8. </w:t>
+      </w:r>
+      <w:r>
+        <w:rPr>
+          <w:rFonts w:ascii="Calibri" w:hAnsi="Calibri"/>
+          <w:b w:val="0"/>
+          <w:i w:val="0"/>
+          <w:color w:val="444D5E"/>
+          <w:sz w:val="22"/>
+        </w:rPr>
+      </w:r>
+      <w:r>
+        <w:rPr>
+          <w:rFonts w:ascii="Courier New" w:hAnsi="Courier New"/>
+          <w:b w:val="0"/>
+          <w:i w:val="0"/>
+          <w:color w:val="1F2937"/>
+          <w:sz w:val="18"/>
+        </w:rPr>
+        <w:t>Cases where the requester level is director or intern or vp, and the request amount exceeds 10000 should result in deny the request.</w:t>
+      </w:r>
+      <w:r>
+        <w:rPr>
+          <w:rFonts w:ascii="Calibri" w:hAnsi="Calibri"/>
+          <w:b w:val="0"/>
+          <w:i w:val="0"/>
+          <w:color w:val="444D5E"/>
+          <w:sz w:val="22"/>
+        </w:rPr>
+        <w:t xml:space="preserve"> *(no-op disguised)*</w:t>
+      </w:r>
+    </w:p>
+    <w:p>
+      <w:pPr>
+        <w:spacing w:before="20" w:after="60"/>
+        <w:ind w:left="454"/>
+      </w:pPr>
+      <w:r>
+        <w:rPr>
+          <w:rFonts w:ascii="Calibri" w:hAnsi="Calibri"/>
+          <w:b/>
+          <w:i w:val="0"/>
+          <w:color w:val="6366F1"/>
+          <w:sz w:val="22"/>
+        </w:rPr>
+        <w:t xml:space="preserve">9. </w:t>
+      </w:r>
+      <w:r>
+        <w:rPr>
+          <w:rFonts w:ascii="Calibri" w:hAnsi="Calibri"/>
+          <w:b w:val="0"/>
+          <w:i w:val="0"/>
+          <w:color w:val="444D5E"/>
+          <w:sz w:val="22"/>
+        </w:rPr>
+      </w:r>
+      <w:r>
+        <w:rPr>
+          <w:rFonts w:ascii="Courier New" w:hAnsi="Courier New"/>
+          <w:b w:val="0"/>
+          <w:i w:val="0"/>
+          <w:color w:val="1F2937"/>
+          <w:sz w:val="18"/>
+        </w:rPr>
+        <w:t>Cases where the request amount is less than 100, and the request amount is at least 10000 should result in require manager approval.</w:t>
+      </w:r>
+      <w:r>
+        <w:rPr>
+          <w:rFonts w:ascii="Calibri" w:hAnsi="Calibri"/>
+          <w:b w:val="0"/>
+          <w:i w:val="0"/>
+          <w:color w:val="444D5E"/>
+          <w:sz w:val="22"/>
+        </w:rPr>
+        <w:t xml:space="preserve"> *(chain_ref — references chain rule after revocation; model must recognise rule no longer exists)*</w:t>
+      </w:r>
+    </w:p>
+    <w:p>
+      <w:pPr>
+        <w:spacing w:before="40" w:after="120"/>
+      </w:pPr>
+      <w:r>
+        <w:rPr>
+          <w:rFonts w:ascii="Calibri" w:hAnsi="Calibri"/>
+          <w:b w:val="0"/>
+          <w:i w:val="0"/>
+          <w:color w:val="444D5E"/>
+          <w:sz w:val="22"/>
+        </w:rPr>
         <w:t>Claude correctly:</w:t>
       </w:r>
     </w:p>
@@ -5144,7 +5582,7 @@
           <w:color w:val="444D5E"/>
           <w:sz w:val="22"/>
         </w:rPr>
-        <w:t xml:space="preserve">PolicyBench targets a clean, real capability gap: </w:t>
+        <w:t xml:space="preserve">StateBench targets a clean, real capability gap: </w:t>
       </w:r>
       <w:r>
         <w:rPr>

</xml_diff>